<commit_message>
pabeidzu pievienot lapu un kodu
</commit_message>
<xml_diff>
--- a/Piezīmes programmēšanā.docx
+++ b/Piezīmes programmēšanā.docx
@@ -19,115 +19,19 @@
     <w:p/>
     <w:p>
       <w:r>
-        <w:t xml:space="preserve">---INSERT INTO </w:t>
-      </w:r>
-      <w:proofErr w:type="spellStart"/>
-      <w:r>
-        <w:t>lietotaji</w:t>
-      </w:r>
-      <w:proofErr w:type="spellEnd"/>
-      <w:r>
-        <w:t xml:space="preserve"> (</w:t>
-      </w:r>
-      <w:proofErr w:type="spellStart"/>
-      <w:r>
-        <w:t>lietotajvards,parole,vards</w:t>
-      </w:r>
-      <w:proofErr w:type="spellEnd"/>
-      <w:r>
-        <w:t>) VALUES ('</w:t>
-      </w:r>
-      <w:proofErr w:type="spellStart"/>
-      <w:r>
-        <w:t>evijao</w:t>
-      </w:r>
-      <w:proofErr w:type="spellEnd"/>
-      <w:r>
-        <w:t>', 'scrypt:32768:8:1$MsqInSJ5zv1afSxs$73ff8b01dbc20b3c2fe000530fadbfb7646936a73f44cc52e8527c2d95f228db7cf958222ad5d1916b0fb5c761a233fc4a36b7d6d06f3c2382afe3ba78c84c4d', '</w:t>
-      </w:r>
-      <w:proofErr w:type="spellStart"/>
-      <w:r>
-        <w:t>evija</w:t>
-      </w:r>
-      <w:proofErr w:type="spellEnd"/>
-      <w:r>
-        <w:t>')</w:t>
+        <w:t>---INSERT INTO lietotaji (lietotajvards,parole,vards) VALUES ('evijao', 'scrypt:32768:8:1$MsqInSJ5zv1afSxs$73ff8b01dbc20b3c2fe000530fadbfb7646936a73f44cc52e8527c2d95f228db7cf958222ad5d1916b0fb5c761a233fc4a36b7d6d06f3c2382afe3ba78c84c4d', 'evija')</w:t>
       </w:r>
     </w:p>
     <w:p/>
     <w:p>
       <w:r>
-        <w:t xml:space="preserve">---INSERT INTO </w:t>
-      </w:r>
-      <w:proofErr w:type="spellStart"/>
-      <w:r>
-        <w:t>gramatas</w:t>
-      </w:r>
-      <w:proofErr w:type="spellEnd"/>
-      <w:r>
-        <w:t xml:space="preserve"> (</w:t>
-      </w:r>
-      <w:proofErr w:type="spellStart"/>
-      <w:r>
-        <w:t>nosaukums,autors,lapas,saku_lasit,izlasits,vertejums</w:t>
-      </w:r>
-      <w:proofErr w:type="spellEnd"/>
-      <w:r>
-        <w:t>) VALUES ('</w:t>
-      </w:r>
-      <w:proofErr w:type="spellStart"/>
-      <w:r>
-        <w:t>Birthday</w:t>
-      </w:r>
-      <w:proofErr w:type="spellEnd"/>
-      <w:r>
-        <w:t xml:space="preserve"> </w:t>
-      </w:r>
-      <w:proofErr w:type="spellStart"/>
-      <w:r>
-        <w:t>Girl</w:t>
-      </w:r>
-      <w:proofErr w:type="spellEnd"/>
-      <w:r>
-        <w:t>', '</w:t>
-      </w:r>
-      <w:proofErr w:type="spellStart"/>
-      <w:r>
-        <w:t>Penelophe</w:t>
-      </w:r>
-      <w:proofErr w:type="spellEnd"/>
-      <w:r>
-        <w:t xml:space="preserve"> </w:t>
-      </w:r>
-      <w:proofErr w:type="spellStart"/>
-      <w:r>
-        <w:t>Douglas</w:t>
-      </w:r>
-      <w:proofErr w:type="spellEnd"/>
-      <w:r>
-        <w:t>', '349','07.03.2026','17.03.2026','4.5')</w:t>
+        <w:t>---INSERT INTO gramatas (nosaukums,autors,lapas,saku_lasit,izlasits,vertejums) VALUES ('Birthday Girl', 'Penelophe Douglas', '349','07.03.2026','17.03.2026','4.5')</w:t>
       </w:r>
     </w:p>
     <w:p/>
     <w:p>
       <w:r>
-        <w:t xml:space="preserve">---INSERT INTO </w:t>
-      </w:r>
-      <w:proofErr w:type="spellStart"/>
-      <w:r>
-        <w:t>biblioteka</w:t>
-      </w:r>
-      <w:proofErr w:type="spellEnd"/>
-      <w:r>
-        <w:t xml:space="preserve"> (</w:t>
-      </w:r>
-      <w:proofErr w:type="spellStart"/>
-      <w:r>
-        <w:t>lietotaja_id,gramatas_id</w:t>
-      </w:r>
-      <w:proofErr w:type="spellEnd"/>
-      <w:r>
-        <w:t>) VALUES ('1', '1')</w:t>
+        <w:t>---INSERT INTO biblioteka (lietotaja_id,gramatas_id) VALUES ('1', '1')</w:t>
       </w:r>
     </w:p>
     <w:p/>
@@ -245,15 +149,7 @@
               <w:t>Galvenā krāsa</w:t>
             </w:r>
             <w:r>
-              <w:t> (</w:t>
-            </w:r>
-            <w:proofErr w:type="spellStart"/>
-            <w:r>
-              <w:t>Primary</w:t>
-            </w:r>
-            <w:proofErr w:type="spellEnd"/>
-            <w:r>
-              <w:t>)</w:t>
+              <w:t> (Primary)</w:t>
             </w:r>
           </w:p>
         </w:tc>
@@ -315,15 +211,7 @@
               <w:t>Akcenta krāsa</w:t>
             </w:r>
             <w:r>
-              <w:t> (</w:t>
-            </w:r>
-            <w:proofErr w:type="spellStart"/>
-            <w:r>
-              <w:t>Secondary</w:t>
-            </w:r>
-            <w:proofErr w:type="spellEnd"/>
-            <w:r>
-              <w:t>)</w:t>
+              <w:t> (Secondary)</w:t>
             </w:r>
           </w:p>
         </w:tc>
@@ -364,23 +252,7 @@
               <w:t>6A2E35</w:t>
             </w:r>
             <w:r>
-              <w:t>(</w:t>
-            </w:r>
-            <w:proofErr w:type="spellStart"/>
-            <w:r>
-              <w:t>wine</w:t>
-            </w:r>
-            <w:proofErr w:type="spellEnd"/>
-            <w:r>
-              <w:t xml:space="preserve"> </w:t>
-            </w:r>
-            <w:proofErr w:type="spellStart"/>
-            <w:r>
-              <w:t>plum</w:t>
-            </w:r>
-            <w:proofErr w:type="spellEnd"/>
-            <w:r>
-              <w:t>)</w:t>
+              <w:t>(wine plum)</w:t>
             </w:r>
           </w:p>
           <w:p>
@@ -388,23 +260,7 @@
               <w:t>2E2836</w:t>
             </w:r>
             <w:r>
-              <w:t>(</w:t>
-            </w:r>
-            <w:proofErr w:type="spellStart"/>
-            <w:r>
-              <w:t>shadow</w:t>
-            </w:r>
-            <w:proofErr w:type="spellEnd"/>
-            <w:r>
-              <w:t xml:space="preserve"> </w:t>
-            </w:r>
-            <w:proofErr w:type="spellStart"/>
-            <w:r>
-              <w:t>grey</w:t>
-            </w:r>
-            <w:proofErr w:type="spellEnd"/>
-            <w:r>
-              <w:t>)</w:t>
+              <w:t>(shadow grey)</w:t>
             </w:r>
           </w:p>
           <w:p>
@@ -412,15 +268,7 @@
               <w:t>55251D</w:t>
             </w:r>
             <w:r>
-              <w:t>(</w:t>
-            </w:r>
-            <w:proofErr w:type="spellStart"/>
-            <w:r>
-              <w:t>espresso</w:t>
-            </w:r>
-            <w:proofErr w:type="spellEnd"/>
-            <w:r>
-              <w:t>)</w:t>
+              <w:t>(espresso)</w:t>
             </w:r>
           </w:p>
           <w:p>
@@ -428,15 +276,7 @@
               <w:t>3D1308</w:t>
             </w:r>
             <w:r>
-              <w:t xml:space="preserve">(tumsi </w:t>
-            </w:r>
-            <w:proofErr w:type="spellStart"/>
-            <w:r>
-              <w:t>bruna</w:t>
-            </w:r>
-            <w:proofErr w:type="spellEnd"/>
-            <w:r>
-              <w:t>)</w:t>
+              <w:t>(tumsi bruna)</w:t>
             </w:r>
           </w:p>
           <w:p>
@@ -444,15 +284,7 @@
               <w:t>3A1803</w:t>
             </w:r>
             <w:r>
-              <w:t xml:space="preserve">(tumsi </w:t>
-            </w:r>
-            <w:proofErr w:type="spellStart"/>
-            <w:r>
-              <w:t>bruna</w:t>
-            </w:r>
-            <w:proofErr w:type="spellEnd"/>
-            <w:r>
-              <w:t xml:space="preserve"> ari)</w:t>
+              <w:t>(tumsi bruna ari)</w:t>
             </w:r>
           </w:p>
           <w:p>
@@ -460,15 +292,7 @@
               <w:t>BAA898</w:t>
             </w:r>
             <w:r>
-              <w:t>(</w:t>
-            </w:r>
-            <w:proofErr w:type="spellStart"/>
-            <w:r>
-              <w:t>beige</w:t>
-            </w:r>
-            <w:proofErr w:type="spellEnd"/>
-            <w:r>
-              <w:t>)</w:t>
+              <w:t>(beige)</w:t>
             </w:r>
           </w:p>
           <w:p>
@@ -476,23 +300,7 @@
               <w:t>553739</w:t>
             </w:r>
             <w:r>
-              <w:t>(</w:t>
-            </w:r>
-            <w:proofErr w:type="spellStart"/>
-            <w:r>
-              <w:t>chocolate</w:t>
-            </w:r>
-            <w:proofErr w:type="spellEnd"/>
-            <w:r>
-              <w:t xml:space="preserve"> </w:t>
-            </w:r>
-            <w:proofErr w:type="spellStart"/>
-            <w:r>
-              <w:t>plum</w:t>
-            </w:r>
-            <w:proofErr w:type="spellEnd"/>
-            <w:r>
-              <w:t>)</w:t>
+              <w:t>(chocolate plum)</w:t>
             </w:r>
           </w:p>
           <w:p>
@@ -515,15 +323,7 @@
               <w:t>808B7E</w:t>
             </w:r>
             <w:r>
-              <w:t>(</w:t>
-            </w:r>
-            <w:proofErr w:type="spellStart"/>
-            <w:r>
-              <w:t>olive</w:t>
-            </w:r>
-            <w:proofErr w:type="spellEnd"/>
-            <w:r>
-              <w:t>)</w:t>
+              <w:t>(olive)</w:t>
             </w:r>
           </w:p>
           <w:p>
@@ -532,31 +332,7 @@
               <w:t>38382E</w:t>
             </w:r>
             <w:r>
-              <w:t>(</w:t>
-            </w:r>
-            <w:proofErr w:type="spellStart"/>
-            <w:r>
-              <w:t>kip</w:t>
-            </w:r>
-            <w:proofErr w:type="spellEnd"/>
-            <w:r>
-              <w:t xml:space="preserve"> </w:t>
-            </w:r>
-            <w:proofErr w:type="spellStart"/>
-            <w:r>
-              <w:t>dark</w:t>
-            </w:r>
-            <w:proofErr w:type="spellEnd"/>
-            <w:r>
-              <w:t xml:space="preserve"> </w:t>
-            </w:r>
-            <w:proofErr w:type="spellStart"/>
-            <w:r>
-              <w:t>olive</w:t>
-            </w:r>
-            <w:proofErr w:type="spellEnd"/>
-            <w:r>
-              <w:t>)</w:t>
+              <w:t>(kip dark olive)</w:t>
             </w:r>
           </w:p>
           <w:p>
@@ -564,13 +340,8 @@
               <w:t>78545F</w:t>
             </w:r>
             <w:r>
-              <w:t>(</w:t>
-            </w:r>
-            <w:proofErr w:type="spellStart"/>
-            <w:r>
-              <w:t>violetigs</w:t>
-            </w:r>
-            <w:proofErr w:type="spellEnd"/>
+              <w:t>(violetigs</w:t>
+            </w:r>
           </w:p>
         </w:tc>
       </w:tr>
@@ -626,23 +397,7 @@
                 <w:i/>
                 <w:iCs/>
               </w:rPr>
-              <w:t>'</w:t>
-            </w:r>
-            <w:proofErr w:type="spellStart"/>
-            <w:r>
-              <w:rPr>
-                <w:i/>
-                <w:iCs/>
-              </w:rPr>
-              <w:t>Montserrat</w:t>
-            </w:r>
-            <w:proofErr w:type="spellEnd"/>
-            <w:r>
-              <w:rPr>
-                <w:i/>
-                <w:iCs/>
-              </w:rPr>
-              <w:t>'</w:t>
+              <w:t>'Montserrat'</w:t>
             </w:r>
           </w:p>
         </w:tc>
@@ -712,45 +467,23 @@
               <w:t> </w:t>
             </w:r>
             <w:r>
-              <w:t xml:space="preserve">Roboto </w:t>
-            </w:r>
-            <w:proofErr w:type="spellStart"/>
-            <w:r>
-              <w:t>Condensed</w:t>
-            </w:r>
-            <w:proofErr w:type="spellEnd"/>
-          </w:p>
-          <w:p>
-            <w:proofErr w:type="spellStart"/>
-            <w:r>
-              <w:t>Playfair</w:t>
-            </w:r>
-            <w:proofErr w:type="spellEnd"/>
-            <w:r>
-              <w:t xml:space="preserve"> </w:t>
-            </w:r>
-            <w:proofErr w:type="spellStart"/>
-            <w:r>
-              <w:t>Display</w:t>
-            </w:r>
-            <w:proofErr w:type="spellEnd"/>
-          </w:p>
-          <w:p>
-            <w:proofErr w:type="spellStart"/>
+              <w:t>Roboto Condensed</w:t>
+            </w:r>
+          </w:p>
+          <w:p>
+            <w:r>
+              <w:t>Playfair Display</w:t>
+            </w:r>
+          </w:p>
+          <w:p>
             <w:r>
               <w:t>Trispace</w:t>
             </w:r>
-            <w:proofErr w:type="spellEnd"/>
-          </w:p>
-          <w:p>
-            <w:r>
-              <w:t xml:space="preserve">Roboto </w:t>
-            </w:r>
-            <w:proofErr w:type="spellStart"/>
-            <w:r>
-              <w:t>Flex</w:t>
-            </w:r>
-            <w:proofErr w:type="spellEnd"/>
+          </w:p>
+          <w:p>
+            <w:r>
+              <w:t>Roboto Flex</w:t>
+            </w:r>
           </w:p>
         </w:tc>
         <w:tc>
@@ -797,17 +530,8 @@
                 <w:b/>
                 <w:bCs/>
               </w:rPr>
-              <w:t xml:space="preserve">Ikonu </w:t>
-            </w:r>
-            <w:proofErr w:type="spellStart"/>
-            <w:r>
-              <w:rPr>
-                <w:b/>
-                <w:bCs/>
-              </w:rPr>
-              <w:t>pakotne</w:t>
-            </w:r>
-            <w:proofErr w:type="spellEnd"/>
+              <w:t>Ikonu pakotne</w:t>
+            </w:r>
           </w:p>
         </w:tc>
         <w:tc>
@@ -824,13 +548,8 @@
             <w:hideMark/>
           </w:tcPr>
           <w:p>
-            <w:proofErr w:type="spellStart"/>
-            <w:r>
-              <w:t>Unicode</w:t>
-            </w:r>
-            <w:proofErr w:type="spellEnd"/>
-            <w:r>
-              <w:t>: U+F4DD</w:t>
+            <w:r>
+              <w:t>Unicode: U+F4DD</w:t>
             </w:r>
           </w:p>
           <w:p>
@@ -848,15 +567,7 @@
               <w:t>HTML: &amp;#xF4DD;</w:t>
             </w:r>
             <w:r>
-              <w:t xml:space="preserve"> </w:t>
-            </w:r>
-            <w:proofErr w:type="spellStart"/>
-            <w:r>
-              <w:t>cilveks</w:t>
-            </w:r>
-            <w:proofErr w:type="spellEnd"/>
-            <w:r>
-              <w:t>+</w:t>
+              <w:t xml:space="preserve"> cilveks+</w:t>
             </w:r>
           </w:p>
           <w:p/>
@@ -880,33 +591,8 @@
                 <w:i/>
                 <w:iCs/>
               </w:rPr>
-              <w:t xml:space="preserve">Piemēram: </w:t>
-            </w:r>
-            <w:proofErr w:type="spellStart"/>
-            <w:r>
-              <w:rPr>
-                <w:i/>
-                <w:iCs/>
-              </w:rPr>
-              <w:t>Bootstrap</w:t>
-            </w:r>
-            <w:proofErr w:type="spellEnd"/>
-            <w:r>
-              <w:rPr>
-                <w:i/>
-                <w:iCs/>
-              </w:rPr>
-              <w:t xml:space="preserve"> </w:t>
-            </w:r>
-            <w:proofErr w:type="spellStart"/>
-            <w:r>
-              <w:rPr>
-                <w:i/>
-                <w:iCs/>
-              </w:rPr>
-              <w:t>Icons</w:t>
-            </w:r>
-            <w:proofErr w:type="spellEnd"/>
+              <w:t>Piemēram: Bootstrap Icons</w:t>
+            </w:r>
           </w:p>
         </w:tc>
       </w:tr>
@@ -930,23 +616,7 @@
                 <w:b/>
                 <w:bCs/>
               </w:rPr>
-              <w:t>Noskaņa (</w:t>
-            </w:r>
-            <w:proofErr w:type="spellStart"/>
-            <w:r>
-              <w:rPr>
-                <w:b/>
-                <w:bCs/>
-              </w:rPr>
-              <w:t>Vibe</w:t>
-            </w:r>
-            <w:proofErr w:type="spellEnd"/>
-            <w:r>
-              <w:rPr>
-                <w:b/>
-                <w:bCs/>
-              </w:rPr>
-              <w:t>)</w:t>
+              <w:t>Noskaņa (Vibe)</w:t>
             </w:r>
           </w:p>
         </w:tc>
@@ -968,15 +638,7 @@
               <w:t> </w:t>
             </w:r>
             <w:r>
-              <w:t xml:space="preserve">Tumšs, </w:t>
-            </w:r>
-            <w:proofErr w:type="spellStart"/>
-            <w:r>
-              <w:t>minimals</w:t>
-            </w:r>
-            <w:proofErr w:type="spellEnd"/>
-            <w:r>
-              <w:t>, estētisks</w:t>
+              <w:t>Tumšs, minimals, estētisks</w:t>
             </w:r>
           </w:p>
         </w:tc>
@@ -1006,6 +668,11 @@
       </w:tr>
     </w:tbl>
     <w:p/>
+    <w:p>
+      <w:r>
+        <w:t>Hex to rgb</w:t>
+      </w:r>
+    </w:p>
     <w:sectPr>
       <w:pgSz w:w="11906" w:h="16838"/>
       <w:pgMar w:top="1440" w:right="1800" w:bottom="1440" w:left="1800" w:header="708" w:footer="708" w:gutter="0"/>

</xml_diff>